<commit_message>
Prepare clean submission documents
</commit_message>
<xml_diff>
--- a/docs/地图上的人_创作说明及AI使用说明.docx
+++ b/docs/地图上的人_创作说明及AI使用说明.docx
@@ -225,18 +225,6 @@
     </w:p>
     <w:p>
       <w:pPr>
-        <w:ind w:firstLine="460"/>
-      </w:pPr>
-      <w:r>
-        <w:rPr>
-          <w:rFonts w:ascii="Times New Roman" w:hAnsi="Times New Roman" w:eastAsia="Songti SC"/>
-          <w:color w:val="000000"/>
-        </w:rPr>
-        <w:t>参赛者负责选题取舍、提出修改意见和最终审核，对作品的人物叙述、互动设置与对外呈现作出最终判断。AI参与范围以本说明记录的工具及用途为准，史料来源、生成图像和程序交互均纳入最终审核。</w:t>
-      </w:r>
-    </w:p>
-    <w:p>
-      <w:pPr>
         <w:pStyle w:val="Heading1"/>
       </w:pPr>
       <w:r>
@@ -356,7 +344,7 @@
           <w:rFonts w:ascii="Times New Roman" w:hAnsi="Times New Roman" w:eastAsia="Songti SC"/>
           <w:color w:val="000000"/>
         </w:rPr>
-        <w:t>作品适合用于主题展览、班级分享和地理学习交流。传播时应保留史实出处、艺术表达说明及AI使用声明。正式报送应由参赛者向主办方确认互动网站可接受的载体与格式，在线地址不能替代主办方要求的作品文件和申报材料。</w:t>
+        <w:t>作品适合用于主题展览、班级分享和地理学习交流。作品保留史实出处、艺术表达说明及AI使用声明，便于观众核验资料并理解不同内容的表达边界。</w:t>
       </w:r>
     </w:p>
     <w:p>

</xml_diff>